<commit_message>
Update Word project report (.docx) with candidate Ajay M branding and enhanced styling
</commit_message>
<xml_diff>
--- a/docs/Week4_Predictive_Modeling_and_Optimization.docx
+++ b/docs/Week4_Predictive_Modeling_and_Optimization.docx
@@ -18,10 +18,10 @@
             <w:tcW w:type="dxa" w:w="9360"/>
             <w:shd w:fill="1E3A8A"/>
             <w:tcMar>
-              <w:top w:w="400" w:type="dxa"/>
-              <w:bottom w:w="400" w:type="dxa"/>
-              <w:left w:w="300" w:type="dxa"/>
-              <w:right w:w="300" w:type="dxa"/>
+              <w:top w:w="450" w:type="dxa"/>
+              <w:bottom w:w="450" w:type="dxa"/>
+              <w:left w:w="320" w:type="dxa"/>
+              <w:right w:w="320" w:type="dxa"/>
             </w:tcMar>
           </w:tcPr>
           <w:p>
@@ -56,7 +56,7 @@
                 <w:color w:val="E2E8F0"/>
                 <w:sz w:val="24"/>
               </w:rPr>
-              <w:t>Delivery Time Prediction, Anti-Leakage Pipeline Benchmarking, and Multi-Region Operational Resource Optimization</w:t>
+              <w:t>Logistics Delivery Time Prediction, Anti-Leakage Pipeline Benchmarking, and Multi-Region Operational Resource Optimization</w:t>
               <w:br/>
               <w:br/>
               <w:br/>
@@ -65,18 +65,139 @@
               <w:rPr>
                 <w:rFonts w:ascii="Arial" w:hAnsi="Arial"/>
                 <w:color w:val="FFFFFF"/>
-                <w:sz w:val="21"/>
+                <w:sz w:val="20"/>
               </w:rPr>
-              <w:t>Candidate Name: Ajay M</w:t>
+              <w:t>━━━━━━━━━━━━━━━━━━━━━━━━━━━━━━━━━━━━━━━━━━━━━━━━━</w:t>
               <w:br/>
-              <w:t>Role: Senior Data Scientist &amp; Optimization Specialist</w:t>
+              <w:t>CANDIDATE INFORMATION &amp; METADATA</w:t>
               <w:br/>
-              <w:t>Environment: Python 3.14 / Scikit-Learn 1.9.0 / SciPy 1.18.1</w:t>
+              <w:t>━━━━━━━━━━━━━━━━━━━━━━━━━━━━━━━━━━━━━━━━━━━━━━━━━</w:t>
+              <w:br/>
+              <w:t>Author / Candidate Name: Ajay M</w:t>
+              <w:br/>
+              <w:t>Role: Senior Data Scientist, ML Engineer &amp; Optimization Consultant</w:t>
+              <w:br/>
+              <w:t>Academic Track: Logistics Analytics &amp; Machine Learning Internship</w:t>
+              <w:br/>
+              <w:t>Technical Stack: Python 3.14 / Scikit-Learn 1.9.0 / SciPy 1.18.1</w:t>
+              <w:br/>
+              <w:t>GitHub Repository: https://github.com/ajaymari74-cyber/logisticweek4.git</w:t>
               <w:br/>
               <w:t>Submission Date: August 2026</w:t>
               <w:br/>
             </w:r>
           </w:p>
+        </w:tc>
+      </w:tr>
+    </w:tbl>
+    <w:p>
+      <w:r>
+        <w:br w:type="page"/>
+      </w:r>
+    </w:p>
+    <w:p>
+      <w:pPr>
+        <w:pStyle w:val="Heading1"/>
+        <w:spacing w:before="200" w:after="240"/>
+      </w:pPr>
+      <w:r>
+        <w:rPr>
+          <w:rFonts w:ascii="Arial" w:hAnsi="Arial"/>
+          <w:color w:val="1E3A8A"/>
+          <w:sz w:val="30"/>
+        </w:rPr>
+        <w:t>Certificate of Originality &amp; Candidate Declaration</w:t>
+      </w:r>
+    </w:p>
+    <w:p>
+      <w:pPr>
+        <w:spacing w:line="288" w:lineRule="auto"/>
+      </w:pPr>
+      <w:r>
+        <w:rPr>
+          <w:rFonts w:ascii="Arial" w:hAnsi="Arial"/>
+          <w:color w:val="0F172A"/>
+          <w:sz w:val="20"/>
+        </w:rPr>
+        <w:t>I, Ajay M, hereby declare that this project report entitled "Week 4: Predictive Modeling and Optimization in Logistics Systems" is a bonafide record of independent analytical and technical work executed by me under the Advanced Logistics Analytics and Machine Learning Internship Program. All data preprocessing, feature engineering, machine learning modeling, cross-validation, hyperparameter tuning, operations research optimization, and empirical result documentation were developed and validated by me using reproducible Python workflows.</w:t>
+      </w:r>
+    </w:p>
+    <w:p/>
+    <w:tbl>
+      <w:tblPr>
+        <w:tblW w:type="auto" w:w="0"/>
+        <w:jc w:val="center"/>
+        <w:tblLayout w:type="fixed"/>
+        <w:tblLook w:firstColumn="1" w:firstRow="1" w:lastColumn="0" w:lastRow="0" w:noHBand="0" w:noVBand="1" w:val="04A0"/>
+      </w:tblPr>
+      <w:tblGrid>
+        <w:gridCol w:w="4608"/>
+        <w:gridCol w:w="4608"/>
+      </w:tblGrid>
+      <w:tr>
+        <w:tc>
+          <w:tcPr>
+            <w:tcW w:type="dxa" w:w="4680"/>
+          </w:tcPr>
+          <w:p>
+            <w:r>
+              <w:rPr>
+                <w:b/>
+              </w:rPr>
+              <w:t>Candidate Signature:</w:t>
+              <w:br/>
+              <w:br/>
+              <w:t>_______________________</w:t>
+              <w:br/>
+            </w:r>
+            <w:r>
+              <w:rPr>
+                <w:color w:val="1E3A8A"/>
+              </w:rPr>
+              <w:t>Ajay M</w:t>
+              <w:br/>
+              <w:t>Lead Data Scientist &amp; Candidate</w:t>
+            </w:r>
+          </w:p>
+        </w:tc>
+        <w:tc>
+          <w:tcPr>
+            <w:tcW w:type="dxa" w:w="4680"/>
+          </w:tcPr>
+          <w:p>
+            <w:r>
+              <w:rPr>
+                <w:b/>
+              </w:rPr>
+              <w:t>Internship Evaluator / Mentor:</w:t>
+              <w:br/>
+              <w:br/>
+              <w:t>_______________________</w:t>
+              <w:br/>
+            </w:r>
+            <w:r>
+              <w:rPr>
+                <w:color w:val="1E3A8A"/>
+              </w:rPr>
+              <w:t>Academic Project Reviewer</w:t>
+              <w:br/>
+              <w:t>Faculty of Data Science &amp; Logistics</w:t>
+            </w:r>
+          </w:p>
+        </w:tc>
+      </w:tr>
+      <w:tr>
+        <w:tc>
+          <w:tcPr>
+            <w:tcW w:type="dxa" w:w="4680"/>
+          </w:tcPr>
+          <w:p/>
+        </w:tc>
+        <w:tc>
+          <w:tcPr>
+            <w:tcW w:type="dxa" w:w="4680"/>
+          </w:tcPr>
+          <w:p/>
         </w:tc>
       </w:tr>
     </w:tbl>
@@ -3965,7 +4086,7 @@
           </w:tcPr>
           <w:p>
             <w:pPr>
-              <w:spacing w:before="40" w:after="80"/>
+              <w:spacing w:before="40" w:after="60"/>
             </w:pPr>
             <w:r>
               <w:rPr>
@@ -6166,7 +6287,7 @@
                     <pic:cNvPicPr/>
                   </pic:nvPicPr>
                   <pic:blipFill>
-                    <a:blip r:embed="rId10"/>
+                    <a:blip r:embed="rId11"/>
                     <a:stretch>
                       <a:fillRect/>
                     </a:stretch>
@@ -6606,6 +6727,55 @@
         <w:t>15. Hyperparameter Tuning</w:t>
       </w:r>
     </w:p>
+    <w:p/>
+    <w:p>
+      <w:r>
+        <w:drawing>
+          <wp:inline xmlns:a="http://schemas.openxmlformats.org/drawingml/2006/main" xmlns:pic="http://schemas.openxmlformats.org/drawingml/2006/picture">
+            <wp:extent cx="5303520" cy="3281848"/>
+            <wp:docPr id="2" name="Picture 2"/>
+            <wp:cNvGraphicFramePr>
+              <a:graphicFrameLocks noChangeAspect="1"/>
+            </wp:cNvGraphicFramePr>
+            <a:graphic>
+              <a:graphicData uri="http://schemas.openxmlformats.org/drawingml/2006/picture">
+                <pic:pic>
+                  <pic:nvPicPr>
+                    <pic:cNvPr id="0" name="07_hyperparameter_tuning_impact.png"/>
+                    <pic:cNvPicPr/>
+                  </pic:nvPicPr>
+                  <pic:blipFill>
+                    <a:blip r:embed="rId12"/>
+                    <a:stretch>
+                      <a:fillRect/>
+                    </a:stretch>
+                  </pic:blipFill>
+                  <pic:spPr>
+                    <a:xfrm>
+                      <a:off x="0" y="0"/>
+                      <a:ext cx="5303520" cy="3281848"/>
+                    </a:xfrm>
+                    <a:prstGeom prst="rect"/>
+                  </pic:spPr>
+                </pic:pic>
+              </a:graphicData>
+            </a:graphic>
+          </wp:inline>
+        </w:drawing>
+      </w:r>
+    </w:p>
+    <w:p>
+      <w:pPr>
+        <w:jc w:val="center"/>
+      </w:pPr>
+      <w:r>
+        <w:rPr>
+          <w:i/>
+          <w:sz w:val="17"/>
+        </w:rPr>
+        <w:t>Figure 7: GridSearchCV Hyperparameter Tuning Impact Comparison</w:t>
+      </w:r>
+    </w:p>
     <w:p>
       <w:pPr>
         <w:pStyle w:val="Heading2"/>
@@ -7110,7 +7280,7 @@
         <w:drawing>
           <wp:inline xmlns:a="http://schemas.openxmlformats.org/drawingml/2006/main" xmlns:pic="http://schemas.openxmlformats.org/drawingml/2006/picture">
             <wp:extent cx="5486400" cy="1980524"/>
-            <wp:docPr id="2" name="Picture 2"/>
+            <wp:docPr id="3" name="Picture 3"/>
             <wp:cNvGraphicFramePr>
               <a:graphicFrameLocks noChangeAspect="1"/>
             </wp:cNvGraphicFramePr>
@@ -7122,7 +7292,7 @@
                     <pic:cNvPicPr/>
                   </pic:nvPicPr>
                   <pic:blipFill>
-                    <a:blip r:embed="rId11"/>
+                    <a:blip r:embed="rId13"/>
                     <a:stretch>
                       <a:fillRect/>
                     </a:stretch>
@@ -7150,7 +7320,7 @@
           <w:i/>
           <w:sz w:val="17"/>
         </w:rPr>
-        <w:t>Figure 4: Predictive Model Performance Comparison (MAE, RMSE, R²)</w:t>
+        <w:t>Figure 4: Predictive Model Performance Benchmarks (MAE, RMSE, R²)</w:t>
       </w:r>
     </w:p>
     <w:p>
@@ -9355,7 +9525,7 @@
         <w:drawing>
           <wp:inline xmlns:a="http://schemas.openxmlformats.org/drawingml/2006/main" xmlns:pic="http://schemas.openxmlformats.org/drawingml/2006/picture">
             <wp:extent cx="5029200" cy="4393888"/>
-            <wp:docPr id="3" name="Picture 3"/>
+            <wp:docPr id="4" name="Picture 4"/>
             <wp:cNvGraphicFramePr>
               <a:graphicFrameLocks noChangeAspect="1"/>
             </wp:cNvGraphicFramePr>
@@ -9367,7 +9537,7 @@
                     <pic:cNvPicPr/>
                   </pic:nvPicPr>
                   <pic:blipFill>
-                    <a:blip r:embed="rId12"/>
+                    <a:blip r:embed="rId14"/>
                     <a:stretch>
                       <a:fillRect/>
                     </a:stretch>
@@ -9395,7 +9565,7 @@
           <w:i/>
           <w:sz w:val="17"/>
         </w:rPr>
-        <w:t>Figure 1: Actual vs. Predicted Delivery Time Scatter Plot</w:t>
+        <w:t>Figure 1: Actual vs. Predicted Delivery Time Scatter Plot (y = x Line)</w:t>
       </w:r>
     </w:p>
     <w:p/>
@@ -9404,7 +9574,7 @@
         <w:drawing>
           <wp:inline xmlns:a="http://schemas.openxmlformats.org/drawingml/2006/main" xmlns:pic="http://schemas.openxmlformats.org/drawingml/2006/picture">
             <wp:extent cx="5029200" cy="3751131"/>
-            <wp:docPr id="4" name="Picture 4"/>
+            <wp:docPr id="5" name="Picture 5"/>
             <wp:cNvGraphicFramePr>
               <a:graphicFrameLocks noChangeAspect="1"/>
             </wp:cNvGraphicFramePr>
@@ -9416,7 +9586,7 @@
                     <pic:cNvPicPr/>
                   </pic:nvPicPr>
                   <pic:blipFill>
-                    <a:blip r:embed="rId13"/>
+                    <a:blip r:embed="rId15"/>
                     <a:stretch>
                       <a:fillRect/>
                     </a:stretch>
@@ -9453,7 +9623,7 @@
         <w:drawing>
           <wp:inline xmlns:a="http://schemas.openxmlformats.org/drawingml/2006/main" xmlns:pic="http://schemas.openxmlformats.org/drawingml/2006/picture">
             <wp:extent cx="5303520" cy="2325527"/>
-            <wp:docPr id="5" name="Picture 5"/>
+            <wp:docPr id="6" name="Picture 6"/>
             <wp:cNvGraphicFramePr>
               <a:graphicFrameLocks noChangeAspect="1"/>
             </wp:cNvGraphicFramePr>
@@ -9465,7 +9635,7 @@
                     <pic:cNvPicPr/>
                   </pic:nvPicPr>
                   <pic:blipFill>
-                    <a:blip r:embed="rId14"/>
+                    <a:blip r:embed="rId16"/>
                     <a:stretch>
                       <a:fillRect/>
                     </a:stretch>
@@ -11218,7 +11388,7 @@
         <w:drawing>
           <wp:inline xmlns:a="http://schemas.openxmlformats.org/drawingml/2006/main" xmlns:pic="http://schemas.openxmlformats.org/drawingml/2006/picture">
             <wp:extent cx="5303520" cy="3420529"/>
-            <wp:docPr id="6" name="Picture 6"/>
+            <wp:docPr id="7" name="Picture 7"/>
             <wp:cNvGraphicFramePr>
               <a:graphicFrameLocks noChangeAspect="1"/>
             </wp:cNvGraphicFramePr>
@@ -11230,7 +11400,7 @@
                     <pic:cNvPicPr/>
                   </pic:nvPicPr>
                   <pic:blipFill>
-                    <a:blip r:embed="rId15"/>
+                    <a:blip r:embed="rId17"/>
                     <a:stretch>
                       <a:fillRect/>
                     </a:stretch>
@@ -12726,7 +12896,7 @@
           </w:tcPr>
           <w:p>
             <w:pPr>
-              <w:spacing w:before="40" w:after="80"/>
+              <w:spacing w:before="40" w:after="60"/>
             </w:pPr>
             <w:r>
               <w:rPr>
@@ -13553,7 +13723,7 @@
         <w:drawing>
           <wp:inline xmlns:a="http://schemas.openxmlformats.org/drawingml/2006/main" xmlns:pic="http://schemas.openxmlformats.org/drawingml/2006/picture">
             <wp:extent cx="5303520" cy="3509771"/>
-            <wp:docPr id="7" name="Picture 7"/>
+            <wp:docPr id="8" name="Picture 8"/>
             <wp:cNvGraphicFramePr>
               <a:graphicFrameLocks noChangeAspect="1"/>
             </wp:cNvGraphicFramePr>
@@ -13565,7 +13735,7 @@
                     <pic:cNvPicPr/>
                   </pic:nvPicPr>
                   <pic:blipFill>
-                    <a:blip r:embed="rId16"/>
+                    <a:blip r:embed="rId18"/>
                     <a:stretch>
                       <a:fillRect/>
                     </a:stretch>
@@ -13602,7 +13772,7 @@
         <w:drawing>
           <wp:inline xmlns:a="http://schemas.openxmlformats.org/drawingml/2006/main" xmlns:pic="http://schemas.openxmlformats.org/drawingml/2006/picture">
             <wp:extent cx="5303520" cy="2885502"/>
-            <wp:docPr id="8" name="Picture 8"/>
+            <wp:docPr id="9" name="Picture 9"/>
             <wp:cNvGraphicFramePr>
               <a:graphicFrameLocks noChangeAspect="1"/>
             </wp:cNvGraphicFramePr>
@@ -13614,7 +13784,7 @@
                     <pic:cNvPicPr/>
                   </pic:nvPicPr>
                   <pic:blipFill>
-                    <a:blip r:embed="rId17"/>
+                    <a:blip r:embed="rId19"/>
                     <a:stretch>
                       <a:fillRect/>
                     </a:stretch>
@@ -16715,7 +16885,8 @@
       </w:r>
     </w:p>
     <w:sectPr>
-      <w:footerReference w:type="default" r:id="rId9"/>
+      <w:headerReference w:type="default" r:id="rId9"/>
+      <w:footerReference w:type="default" r:id="rId10"/>
       <w:pgSz w:w="12240" w:h="15840"/>
       <w:pgMar w:top="1440" w:right="1440" w:bottom="1440" w:left="1440" w:header="720" w:footer="720" w:gutter="0"/>
       <w:cols w:space="720"/>
@@ -16738,10 +16909,29 @@
         <w:color w:val="64748B"/>
         <w:sz w:val="17"/>
       </w:rPr>
-      <w:t>Week 4: Predictive Modeling &amp; Optimization in Logistics Systems | Ajay M</w:t>
+      <w:t>Candidate: Ajay M  •  Track: Advanced Logistics Analytics &amp; ML Internship</w:t>
     </w:r>
   </w:p>
 </w:ftr>
+</file>
+
+<file path=word/header1.xml><?xml version="1.0" encoding="utf-8"?>
+<w:hdr xmlns:m="http://schemas.openxmlformats.org/officeDocument/2006/math" xmlns:mc="http://schemas.openxmlformats.org/markup-compatibility/2006" xmlns:mo="http://schemas.microsoft.com/office/mac/office/2008/main" xmlns:mv="urn:schemas-microsoft-com:mac:vml" xmlns:o="urn:schemas-microsoft-com:office:office" xmlns:r="http://schemas.openxmlformats.org/officeDocument/2006/relationships" xmlns:v="urn:schemas-microsoft-com:vml" xmlns:w10="urn:schemas-microsoft-com:office:word" xmlns:w14="http://schemas.microsoft.com/office/word/2010/wordml" xmlns:w="http://schemas.openxmlformats.org/wordprocessingml/2006/main" xmlns:wne="http://schemas.microsoft.com/office/word/2006/wordml" xmlns:wp14="http://schemas.microsoft.com/office/word/2010/wordprocessingDrawing" xmlns:wp="http://schemas.openxmlformats.org/drawingml/2006/wordprocessingDrawing" xmlns:wpc="http://schemas.microsoft.com/office/word/2010/wordprocessingCanvas" xmlns:wpg="http://schemas.microsoft.com/office/word/2010/wordprocessingGroup" xmlns:wpi="http://schemas.microsoft.com/office/word/2010/wordprocessingInk" xmlns:wps="http://schemas.microsoft.com/office/word/2010/wordprocessingShape" mc:Ignorable="w14 wp14">
+  <w:p>
+    <w:pPr>
+      <w:pStyle w:val="Header"/>
+      <w:jc w:val="right"/>
+    </w:pPr>
+    <w:r>
+      <w:rPr>
+        <w:rFonts w:ascii="Arial" w:hAnsi="Arial"/>
+        <w:color w:val="64748B"/>
+        <w:sz w:val="17"/>
+      </w:rPr>
+      <w:t>Week 4: Predictive Modeling &amp; Optimization | Ajay M</w:t>
+    </w:r>
+  </w:p>
+</w:hdr>
 </file>
 
 <file path=word/numbering.xml><?xml version="1.0" encoding="utf-8"?>

</xml_diff>